<commit_message>
docs: remove PM1 django app, add all the topics for PM labs
</commit_message>
<xml_diff>
--- a/51MN Metologija naukovyh doslidjen/1/MN1_KNT-122_Onyshchenko_15.docx
+++ b/51MN Metologija naukovyh doslidjen/1/MN1_KNT-122_Onyshchenko_15.docx
@@ -989,19 +989,7 @@
         <w:rPr>
           <w:lang w:val="uk-UA"/>
         </w:rPr>
-        <w:t>Припущенням автора є т</w:t>
-      </w:r>
-      <w:r>
-        <w:rPr>
-          <w:lang w:val="uk-UA"/>
-        </w:rPr>
-        <w:t>аким</w:t>
-      </w:r>
-      <w:r>
-        <w:rPr>
-          <w:lang w:val="uk-UA"/>
-        </w:rPr>
-        <w:t>, що більшість шуму є високочастотним та може бути прибрано програмно, без втрати корисного тренду погоди.</w:t>
+        <w:t>Припущенням автора є таким, що більшість шуму є високочастотним та може бути прибрано програмно, без втрати корисного тренду погоди.</w:t>
       </w:r>
     </w:p>
     <w:p>
@@ -1882,8 +1870,8 @@
       <w:lang w:val="en-US" w:eastAsia="uk-UA"/>
     </w:rPr>
   </w:style>
-  <w:style w:type="character" w:styleId="Style12">
-    <w:name w:val="Символ нумерації"/>
+  <w:style w:type="character" w:styleId="user">
+    <w:name w:val="Символ нумерації (user)"/>
     <w:qFormat/>
     <w:rPr/>
   </w:style>
@@ -1895,8 +1883,8 @@
       <w:bCs/>
     </w:rPr>
   </w:style>
-  <w:style w:type="character" w:styleId="user">
-    <w:name w:val="Маркери (user)"/>
+  <w:style w:type="character" w:styleId="Style12">
+    <w:name w:val="Маркери"/>
     <w:qFormat/>
     <w:rPr>
       <w:rFonts w:ascii="OpenSymbol" w:hAnsi="OpenSymbol" w:eastAsia="OpenSymbol" w:cs="OpenSymbol"/>
@@ -1912,7 +1900,7 @@
       <w:spacing w:before="240" w:after="120"/>
     </w:pPr>
     <w:rPr>
-      <w:rFonts w:ascii="Liberation Sans" w:hAnsi="Liberation Sans" w:eastAsia="Microsoft YaHei" w:cs="Lucida Sans"/>
+      <w:rFonts w:ascii="Liberation Sans" w:hAnsi="Liberation Sans" w:eastAsia="Microsoft YaHei" w:cs="Arial Unicode MS"/>
       <w:sz w:val="28"/>
       <w:szCs w:val="28"/>
     </w:rPr>
@@ -1957,7 +1945,7 @@
       <w:suppressLineNumbers/>
     </w:pPr>
     <w:rPr>
-      <w:rFonts w:cs="Lucida Sans"/>
+      <w:rFonts w:cs="Arial Unicode MS"/>
     </w:rPr>
   </w:style>
   <w:style w:type="paragraph" w:styleId="user1">
@@ -1970,7 +1958,7 @@
       <w:spacing w:before="240" w:after="120"/>
     </w:pPr>
     <w:rPr>
-      <w:rFonts w:ascii="Liberation Sans" w:hAnsi="Liberation Sans" w:eastAsia="Microsoft YaHei" w:cs="Arial Unicode MS"/>
+      <w:rFonts w:ascii="Liberation Sans" w:hAnsi="Liberation Sans" w:eastAsia="Microsoft YaHei" w:cs="Lucida Sans"/>
       <w:sz w:val="28"/>
       <w:szCs w:val="28"/>
     </w:rPr>
@@ -1983,12 +1971,12 @@
       <w:suppressLineNumbers/>
     </w:pPr>
     <w:rPr>
-      <w:rFonts w:cs="Arial Unicode MS"/>
+      <w:rFonts w:cs="Lucida Sans"/>
     </w:rPr>
   </w:style>
   <w:style w:type="paragraph" w:styleId="IndexHeading">
     <w:name w:val="index heading"/>
-    <w:basedOn w:val="user1"/>
+    <w:basedOn w:val="Style13"/>
     <w:pPr/>
     <w:rPr/>
   </w:style>
@@ -2264,8 +2252,8 @@
     </w:pPr>
     <w:rPr/>
   </w:style>
-  <w:style w:type="paragraph" w:styleId="Style15">
-    <w:name w:val="Верхній і нижній колонтитули"/>
+  <w:style w:type="paragraph" w:styleId="user3">
+    <w:name w:val="Верхній і нижній колонтитули (user)"/>
     <w:basedOn w:val="Normal"/>
     <w:qFormat/>
     <w:pPr>
@@ -2278,8 +2266,8 @@
     </w:pPr>
     <w:rPr/>
   </w:style>
-  <w:style w:type="paragraph" w:styleId="user3">
-    <w:name w:val="Верхній і нижній колонтитули (user)"/>
+  <w:style w:type="paragraph" w:styleId="Style15">
+    <w:name w:val="Верхній і нижній колонтитули"/>
     <w:basedOn w:val="Normal"/>
     <w:qFormat/>
     <w:pPr/>
@@ -2287,14 +2275,14 @@
   </w:style>
   <w:style w:type="paragraph" w:styleId="Header">
     <w:name w:val="header"/>
-    <w:basedOn w:val="Style15"/>
+    <w:basedOn w:val="user3"/>
     <w:pPr>
       <w:suppressLineNumbers/>
     </w:pPr>
     <w:rPr/>
   </w:style>
-  <w:style w:type="numbering" w:styleId="user4" w:default="1">
-    <w:name w:val="Без маркерів (user)"/>
+  <w:style w:type="numbering" w:styleId="Style16" w:default="1">
+    <w:name w:val="Без маркерів"/>
     <w:uiPriority w:val="99"/>
     <w:semiHidden/>
     <w:unhideWhenUsed/>

</xml_diff>